<commit_message>
docs: update stage2 language and build guide
</commit_message>
<xml_diff>
--- a/docs/Epistula_Minervae_specification.docx
+++ b/docs/Epistula_Minervae_specification.docx
@@ -12,6 +12,12 @@
       </w:r>
     </w:p>
     <w:bookmarkStart w:id="20" w:name="загальні-правила"/>
+    <w:p>
+      <w:pPr/>
+      <w:r>
+        <w:t>Стан документа: розділи 1–12 зберігають правила й приклади Stage 1, а розділ 13 описує реалізовані розширення Stage 2. Кореневий grammar.ebnf охоплює обидва етапи.</w:t>
+      </w:r>
+    </w:p>
     <w:p>
       <w:pPr>
         <w:pStyle w:val="Heading2"/>
@@ -415,57 +421,120 @@
         <w:tc>
           <w:tcPr/>
           <w:p>
-            <w:pPr>
-              <w:pStyle w:val="Compact"/>
-              <w:jc w:val="left"/>
-            </w:pPr>
-            <w:r>
-              <w:rPr>
-                <w:rStyle w:val="VerbatimChar"/>
-              </w:rPr>
-              <w:t xml:space="preserve">sententia</w:t>
-            </w:r>
-          </w:p>
-        </w:tc>
-        <w:tc>
-          <w:tcPr/>
-          <w:p>
-            <w:pPr>
-              <w:pStyle w:val="Compact"/>
-              <w:jc w:val="left"/>
-            </w:pPr>
-            <w:r>
-              <w:t xml:space="preserve">булеве значення</w:t>
-            </w:r>
-          </w:p>
-        </w:tc>
-        <w:tc>
-          <w:tcPr/>
-          <w:p>
-            <w:pPr>
-              <w:pStyle w:val="Compact"/>
-              <w:jc w:val="left"/>
-            </w:pPr>
-            <w:r>
-              <w:rPr>
-                <w:rStyle w:val="VerbatimChar"/>
-              </w:rPr>
-              <w:t xml:space="preserve">Veritas</w:t>
-            </w:r>
-            <w:r>
-              <w:t xml:space="preserve"> </w:t>
-            </w:r>
-            <w:r>
-              <w:t xml:space="preserve">або</w:t>
-            </w:r>
-            <w:r>
-              <w:t xml:space="preserve"> </w:t>
-            </w:r>
-            <w:r>
-              <w:rPr>
-                <w:rStyle w:val="VerbatimChar"/>
-              </w:rPr>
-              <w:t xml:space="preserve">Falsus</w:t>
+            <w:r>
+              <w:t>ludicium</w:t>
+            </w:r>
+          </w:p>
+        </w:tc>
+        <w:tc>
+          <w:tcPr/>
+          <w:p>
+            <w:r>
+              <w:t>булеве значення</w:t>
+            </w:r>
+          </w:p>
+        </w:tc>
+        <w:tc>
+          <w:tcPr/>
+          <w:p>
+            <w:r>
+              <w:t>Veritas або Falsus</w:t>
+            </w:r>
+          </w:p>
+        </w:tc>
+      </w:tr>
+      <w:tr>
+        <w:tc>
+          <w:tcPr>
+            <w:tcW w:type="dxa" w:w="2640"/>
+          </w:tcPr>
+          <w:p>
+            <w:r>
+              <w:t>integer</w:t>
+            </w:r>
+          </w:p>
+        </w:tc>
+        <w:tc>
+          <w:tcPr>
+            <w:tcW w:type="dxa" w:w="2640"/>
+          </w:tcPr>
+          <w:p>
+            <w:r>
+              <w:t>синонім 32bitInt</w:t>
+            </w:r>
+          </w:p>
+        </w:tc>
+        <w:tc>
+          <w:tcPr>
+            <w:tcW w:type="dxa" w:w="2640"/>
+          </w:tcPr>
+          <w:p>
+            <w:r>
+              <w:t>−2147483648…2147483647</w:t>
+            </w:r>
+          </w:p>
+        </w:tc>
+      </w:tr>
+      <w:tr>
+        <w:tc>
+          <w:tcPr>
+            <w:tcW w:type="dxa" w:w="2640"/>
+          </w:tcPr>
+          <w:p>
+            <w:r>
+              <w:t>duplex</w:t>
+            </w:r>
+          </w:p>
+        </w:tc>
+        <w:tc>
+          <w:tcPr>
+            <w:tcW w:type="dxa" w:w="2640"/>
+          </w:tcPr>
+          <w:p>
+            <w:r>
+              <w:t>синонім 64bitInt</w:t>
+            </w:r>
+          </w:p>
+        </w:tc>
+        <w:tc>
+          <w:tcPr>
+            <w:tcW w:type="dxa" w:w="2640"/>
+          </w:tcPr>
+          <w:p>
+            <w:r>
+              <w:t>−9223372036854775808…9223372036854775807</w:t>
+            </w:r>
+          </w:p>
+        </w:tc>
+      </w:tr>
+      <w:tr>
+        <w:tc>
+          <w:tcPr>
+            <w:tcW w:type="dxa" w:w="2640"/>
+          </w:tcPr>
+          <w:p>
+            <w:r>
+              <w:t>sententia</w:t>
+            </w:r>
+          </w:p>
+        </w:tc>
+        <w:tc>
+          <w:tcPr>
+            <w:tcW w:type="dxa" w:w="2640"/>
+          </w:tcPr>
+          <w:p>
+            <w:r>
+              <w:t>текст</w:t>
+            </w:r>
+          </w:p>
+        </w:tc>
+        <w:tc>
+          <w:tcPr>
+            <w:tcW w:type="dxa" w:w="2640"/>
+          </w:tcPr>
+          <w:p>
+            <w:r>
+              <w:t>рядок UTF-8</w:t>
             </w:r>
           </w:p>
         </w:tc>
@@ -840,46 +909,7 @@
         <w:pStyle w:val="FirstParagraph"/>
       </w:pPr>
       <w:r>
-        <w:rPr>
-          <w:rStyle w:val="VerbatimChar"/>
-        </w:rPr>
-        <w:t xml:space="preserve">nihil</w:t>
-      </w:r>
-      <w:r>
-        <w:t xml:space="preserve"> </w:t>
-      </w:r>
-      <w:r>
-        <w:t xml:space="preserve">означає відсутність значення. Його можна присвоювати змінній, передавати в</w:t>
-      </w:r>
-      <w:r>
-        <w:t xml:space="preserve"> </w:t>
-      </w:r>
-      <w:r>
-        <w:rPr>
-          <w:rStyle w:val="VerbatimChar"/>
-        </w:rPr>
-        <w:t xml:space="preserve">Scribe</w:t>
-      </w:r>
-      <w:r>
-        <w:t xml:space="preserve"> </w:t>
-      </w:r>
-      <w:r>
-        <w:t xml:space="preserve">та порівнювати з іншим значенням.</w:t>
-      </w:r>
-      <w:r>
-        <w:t xml:space="preserve"> </w:t>
-      </w:r>
-      <w:r>
-        <w:rPr>
-          <w:rStyle w:val="VerbatimChar"/>
-        </w:rPr>
-        <w:t xml:space="preserve">nihil</w:t>
-      </w:r>
-      <w:r>
-        <w:t xml:space="preserve"> </w:t>
-      </w:r>
-      <w:r>
-        <w:t xml:space="preserve">заборонено використовувати в арифметичних операціях; ця перевірка належить семантичному етапу.</w:t>
+        <w:t>nihil означає відсутність значення. Воно потребує явного типу в оголошенні та не бере участі в арифметиці. Ціле, ініціалізоване nihil, зберігається як нуль; текстове значення nihil друкується як nihil і порівнюється з ним як рівне.</w:t>
       </w:r>
     </w:p>
     <w:bookmarkEnd w:id="24"/>
@@ -1634,43 +1664,7 @@
         <w:pStyle w:val="BodyText"/>
       </w:pPr>
       <w:r>
-        <w:t xml:space="preserve">Цілочисельне ділення округляє до нуля. Остача узгоджена з цим діленням:</w:t>
-      </w:r>
-      <w:r>
-        <w:t xml:space="preserve"> </w:t>
-      </w:r>
-      <w:r>
-        <w:rPr>
-          <w:rStyle w:val="VerbatimChar"/>
-        </w:rPr>
-        <w:t xml:space="preserve">a % b = a - trunc(a / b) * b</w:t>
-      </w:r>
-      <w:r>
-        <w:t xml:space="preserve">. Наприклад,</w:t>
-      </w:r>
-      <w:r>
-        <w:t xml:space="preserve"> </w:t>
-      </w:r>
-      <w:r>
-        <w:rPr>
-          <w:rStyle w:val="VerbatimChar"/>
-        </w:rPr>
-        <w:t xml:space="preserve">-7 / 3 = -2</w:t>
-      </w:r>
-      <w:r>
-        <w:t xml:space="preserve">,</w:t>
-      </w:r>
-      <w:r>
-        <w:t xml:space="preserve"> </w:t>
-      </w:r>
-      <w:r>
-        <w:rPr>
-          <w:rStyle w:val="VerbatimChar"/>
-        </w:rPr>
-        <w:t xml:space="preserve">-7 % 3 = -1</w:t>
-      </w:r>
-      <w:r>
-        <w:t xml:space="preserve">. Ділення на нуль і від’ємний степінь є питаннями семантичного етапу; stage 1 будує для них AST, але не обчислює їх як цілі константні значення.</w:t>
+        <w:t>Цілочисельне ділення округляє до нуля; остача використовує той самий дільник. На Stage 2 статично відомий нульовий дільник є помилкою компіляції. Від'ємний степінь у цілочисельній реалізації дає 0.</w:t>
       </w:r>
     </w:p>
     <w:bookmarkEnd w:id="27"/>
@@ -1830,34 +1824,7 @@
         <w:pStyle w:val="BodyText"/>
       </w:pPr>
       <w:r>
-        <w:t xml:space="preserve">Одне порівняння має рівно два операнди й повертає</w:t>
-      </w:r>
-      <w:r>
-        <w:t xml:space="preserve"> </w:t>
-      </w:r>
-      <w:r>
-        <w:rPr>
-          <w:rStyle w:val="VerbatimChar"/>
-        </w:rPr>
-        <w:t xml:space="preserve">sententia</w:t>
-      </w:r>
-      <w:r>
-        <w:t xml:space="preserve">. Ланцюжки на кшталт</w:t>
-      </w:r>
-      <w:r>
-        <w:t xml:space="preserve"> </w:t>
-      </w:r>
-      <w:r>
-        <w:rPr>
-          <w:rStyle w:val="VerbatimChar"/>
-        </w:rPr>
-        <w:t xml:space="preserve">A o-o B o-o C</w:t>
-      </w:r>
-      <w:r>
-        <w:t xml:space="preserve"> </w:t>
-      </w:r>
-      <w:r>
-        <w:t xml:space="preserve">заборонено; їх слід записувати окремими порівняннями на наступному семантичному етапі, коли з’являться логічні оператори.</w:t>
+        <w:t>Одне порівняння має рівно два операнди й повертає ludicium. Ланцюжки порівнянь заборонено.</w:t>
       </w:r>
     </w:p>
     <w:bookmarkEnd w:id="28"/>
@@ -2335,7 +2302,7 @@
         <w:pStyle w:val="FirstParagraph"/>
       </w:pPr>
       <w:r>
-        <w:t xml:space="preserve">Фактичний тип прочитаного значення та перевірка його сумісності визначаються семантичним етапом.</w:t>
+        <w:t>Legere читає одне ціле число; як вираз воно має тип integer. Legere in Name вимагає змінну цілого типу. Scribe не додає автоматичного переносу рядка; /linea задає його явно.</w:t>
       </w:r>
     </w:p>
     <w:bookmarkEnd w:id="31"/>
@@ -2961,31 +2928,7 @@
         <w:pStyle w:val="BodyText"/>
       </w:pPr>
       <w:r>
-        <w:t xml:space="preserve">Це лише обов’язкова range-перевірка stage 1, а не завершений семантичний аналіз. Перевірки невідомих імен, зміни immutable-змінних, булевого типу умов, сумісності типів та фактичне виконання</w:t>
-      </w:r>
-      <w:r>
-        <w:t xml:space="preserve"> </w:t>
-      </w:r>
-      <w:r>
-        <w:rPr>
-          <w:rStyle w:val="VerbatimChar"/>
-        </w:rPr>
-        <w:t xml:space="preserve">Scribe</w:t>
-      </w:r>
-      <w:r>
-        <w:t xml:space="preserve">/</w:t>
-      </w:r>
-      <w:r>
-        <w:rPr>
-          <w:rStyle w:val="VerbatimChar"/>
-        </w:rPr>
-        <w:t xml:space="preserve">Legere</w:t>
-      </w:r>
-      <w:r>
-        <w:t xml:space="preserve"> </w:t>
-      </w:r>
-      <w:r>
-        <w:t xml:space="preserve">належать наступним етапам згідно з PDF.</w:t>
+        <w:t>У Stage 2 окремий семантичний прохід перевіряє імена, mutability, тип умов, сумісність типів і виклики. Генератор виконує Scribe та Legere через printf і scanf.</w:t>
       </w:r>
     </w:p>
     <w:p>
@@ -3127,7 +3070,127 @@
     </w:p>
     <w:bookmarkEnd w:id="36"/>
     <w:bookmarkEnd w:id="37"/>
-    <w:sectPr/>
+    <w:p>
+      <w:pPr>
+        <w:pStyle w:val="Heading1"/>
+      </w:pPr>
+      <w:r>
+        <w:t>13. Розширення Stage 2</w:t>
+      </w:r>
+    </w:p>
+    <w:p>
+      <w:pPr>
+        <w:pStyle w:val="Heading2"/>
+      </w:pPr>
+      <w:r>
+        <w:t>13.1. Типи та виведення типу</w:t>
+      </w:r>
+    </w:p>
+    <w:p>
+      <w:r>
+        <w:t>integer є повним синонімом 32bitInt, а duplex — 64bitInt. Старі назви зберігаються. ludicium є булевим типом, sententia — текстовим; старе булеве використання sententia зберігається лише в описаному вище контексті. fractio не вводиться. Сумісність двох цілих типів діє в обох напрямках. Відомий константний результат, що не вміщується в явно вказаний тип цілі, залишається помилкою переповнення, як у Stage 1.</w:t>
+      </w:r>
+    </w:p>
+    <w:p>
+      <w:r>
+        <w:t>Тип звичайної змінної або поля можна опустити, коли ініціалізатор дає однозначний тип: variabilis p &lt;- Point cape 3. та immutabilis Limit &lt;- 10. Явна форма Stage 1 також лишається чинною. Для окремого цілого літерала обирається integer, якщо він у межах 32 біт, інакше duplex, якщо він у межах 64 біт. nihil сам по собі не дає типу для нового оголошення, отже потрібна явна анотація. У полі без ініціалізатора анотація також обов'язкова: variabilis integer x; є коректним, variabilis x; — ні. Типи параметрів і результату функції або методу завжди явні.</w:t>
+      </w:r>
+    </w:p>
+    <w:p>
+      <w:r>
+        <w:t>Невідоме під час компіляції duplex, звужене до integer, залишає молодші 32 біти з інтерпретацією як знакового числа. Наприклад, результат функції 4294967297 після звуження дорівнює 1. Відомий завеликий константний вираз відхиляється під час компіляції.</w:t>
+      </w:r>
+    </w:p>
+    <w:p>
+      <w:pPr>
+        <w:pStyle w:val="Heading2"/>
+      </w:pPr>
+      <w:r>
+        <w:t>13.2. Функції та повернення</w:t>
+      </w:r>
+    </w:p>
+    <w:p>
+      <w:r>
+        <w:t>Іменована функція має форму nuntia edictum Name quo cape параметри remitteque Тип &lt;&lt; тіло &gt;&gt;.. Параметр записується як Тип Ім'я; параметри розділені комами. cape nihil означає порожній список. remitteque nihil означає відсутність результату. Функція з результатом завершує кожен можливий шлях інструкцією reditus вираз!; функція без результату може використати reditus nihil!. ! є кінцем інструкції повернення, додатковий ; після нього не потрібен.</w:t>
+      </w:r>
+    </w:p>
+    <w:p>
+      <w:r>
+        <w:t>Альтернативне оголошення ТипРезультату Name &lt;- nuntia edictum quo cape параметри &lt;&lt; тіло &gt;&gt;. так само створює функцію з іменем Name, а не змінну. Тип ліворуч — тип результату; в тілі діє та сама команда reditus. Для функцій без результату основна форма з remitteque nihil є однозначною.</w:t>
+      </w:r>
+    </w:p>
+    <w:p>
+      <w:r>
+        <w:t>Виклик: Name(аргументи) або Name quo cape аргументи. Порожній виклик: Name(nihil) або Name quo cape nihil. Аргументи — повні вирази; виклик можна вкладати в інший виклик. Як окрема інструкція виклик закінчується . на верхньому рівні або ; всередині блоку. Усередині виразу окремого завершувача немає. Тіло звичайної функції бачить параметри, локальні змінні, глобальні значення, оголошені раніше, та сигнатури всіх функцій. Функція може викликати саму себе та функцію, оголошену нижче; усі сигнатури реєструються перед аналізом тіл.</w:t>
+      </w:r>
+    </w:p>
+    <w:p>
+      <w:pPr>
+        <w:pStyle w:val="Heading2"/>
+      </w:pPr>
+      <w:r>
+        <w:t>13.3. Структури, поля та створення об'єкта</w:t>
+      </w:r>
+    </w:p>
+    <w:p>
+      <w:r>
+        <w:t>Структура оголошується nuntia structuram Name &lt;&lt; поля й методи &gt;&gt;.. Варіант nuntia structuram immutabilem Name quo &lt;&lt; ... &gt;&gt;. позначає незмінний тип структури. Поле використовує звичне variabilis або immutabilis/inaeternum, необов'язковий тип лише за наявності ініціалізатора, і завершується ;. Поле з ініціалізатором отримує це значення за замовчуванням під час створення об'єкта. Для поля без ініціалізатора значення треба передати конструктору.</w:t>
+      </w:r>
+    </w:p>
+    <w:p>
+      <w:r>
+        <w:t>Створення: Name cape значення, де значення можуть бути позиційними виразами або іменованими field &lt;- вираз і можуть чергуватися. Іменований аргумент заповнює назване поле; позиційний — перше ще не заповнене поле в порядку оголошення. Повтор поля, невідоме поле, зайвий аргумент або відсутнє поле без default є помилкою. Значення defaults обчислюються при кожному створенні об'єкта, а не один раз під час оголошення типу.</w:t>
+      </w:r>
+    </w:p>
+    <w:p>
+      <w:r>
+        <w:t>Доступ до поля та методу використовує . або &gt;; їх можна змішувати: p.center &gt; x, p &gt; center.x. Присвоєння p &gt; center &gt; x &lt;- 5. дозволене, якщо початковий об'єкт і кожне поле ланцюжка, через яке проходить зміна, є змінними. immutabilis Point p &lt;- ... створює незмінний об'єкт; через нього не змінюються вкладені об'єкти чи поля. Окремого типу посилання мова не додає.</w:t>
+      </w:r>
+    </w:p>
+    <w:p>
+      <w:r>
+        <w:t>Default поля обчислюється під час кожного створення об'єкта в порядку оголошення. Він може читати поля, ініціалізовані раніше в цьому порядку; звернення до пізнішого поля є помилкою невідомого імені під час аналізу default-виразу.</w:t>
+      </w:r>
+    </w:p>
+    <w:p>
+      <w:pPr>
+        <w:pStyle w:val="Heading2"/>
+      </w:pPr>
+      <w:r>
+        <w:t>13.4. Методи та пошук імен</w:t>
+      </w:r>
+    </w:p>
+    <w:p>
+      <w:r>
+        <w:t>Метод оголошується всередині структури тим самим nuntia edictum і викликається на об'єкті: p.Distance quo cape nihil або p &gt; Distance(nihil). В тілі методу неявно доступні поля та інші методи тієї самої структури. Пошук звичайного імені: локальні змінні й параметри → поля поточного об'єкта → глобальні імена.</w:t>
+      </w:r>
+    </w:p>
+    <w:p>
+      <w:r>
+        <w:t>hoc називає поточний об'єкт усередині методу; hoc &lt;- Name cape ... замінює його цілком. Метод є змінювальним, якщо записує поле, замінює hoc або викликає змінювальний метод. Виклик такого методу на незмінному об'єкті — семантична помилка.</w:t>
+      </w:r>
+    </w:p>
+    <w:p>
+      <w:pPr>
+        <w:pStyle w:val="Heading2"/>
+      </w:pPr>
+      <w:r>
+        <w:t>13.5. Ввід, вивід та сумісність</w:t>
+      </w:r>
+    </w:p>
+    <w:p>
+      <w:r>
+        <w:t>Legere читає одне ціле число зі стандартного вводу. Scribe друкує ціле, ludicium як true/false, sententia як текст, безпосередній текстовий літерал з маркером - або об'єкт. Для об'єкта обрано форму Type{field=value, field2=value2} з полями в порядку оголошення; вкладені об'єкти друкуються рекурсивно. Scribe не додає автоматичного переносу рядка; /linea у тексті додає його явно.</w:t>
+      </w:r>
+    </w:p>
+    <w:p>
+      <w:r>
+        <w:t>Сумісність із валідними прикладами Stage 1 включає nihil у типізованій змінній, порівняння цілого результату Legere з текстом і від'ємний показник цілого степеня. Значення різних нечислових типів при рівності дають Falsus, при нерівності — Veritas; обидва операнди все одно обчислюються. Від'ємний цілий показник у поточній цілочисельній реалізації дає 0.</w:t>
+      </w:r>
+    </w:p>
+    <w:sectPr>
+      <w:pgSz w:w="11906" w:h="16838"/>
+    </w:sectPr>
   </w:body>
 </w:document>
 </file>

</xml_diff>

<commit_message>
fix: allow unmarked trailing Scribe strings
</commit_message>
<xml_diff>
--- a/docs/Epistula_Minervae_specification.docx
+++ b/docs/Epistula_Minervae_specification.docx
@@ -1,6 +1,6 @@
 
 <file path=word/document.xml><?xml version="1.0" encoding="utf-8"?>
-<w:document xmlns:w="http://schemas.openxmlformats.org/wordprocessingml/2006/main" xmlns:m="http://schemas.openxmlformats.org/officeDocument/2006/math" xmlns:r="http://schemas.openxmlformats.org/officeDocument/2006/relationships" xmlns:o="urn:schemas-microsoft-com:office:office" xmlns:v="urn:schemas-microsoft-com:vml" xmlns:w10="urn:schemas-microsoft-com:office:word" xmlns:a="http://schemas.openxmlformats.org/drawingml/2006/main" xmlns:pic="http://schemas.openxmlformats.org/drawingml/2006/picture" xmlns:wp="http://schemas.openxmlformats.org/drawingml/2006/wordprocessingDrawing">
+<w:document xmlns:w="http://schemas.openxmlformats.org/wordprocessingml/2006/main">
   <w:body>
     <w:bookmarkStart w:id="37" w:name="специфікація-мови-epistula-minervae"/>
     <w:p>
@@ -844,19 +844,19 @@
         <w:t xml:space="preserve"> </w:t>
       </w:r>
       <w:r>
-        <w:t xml:space="preserve">дефіс перед рядком є обов’язковим маркером цитування:</w:t>
-      </w:r>
-      <w:r>
-        <w:t xml:space="preserve"> </w:t>
-      </w:r>
-      <w:r>
-        <w:rPr>
-          <w:rStyle w:val="VerbatimChar"/>
-        </w:rPr>
-        <w:t xml:space="preserve">Scribe - "text".</w:t>
-      </w:r>
-      <w:r>
-        <w:t xml:space="preserve">. В інших виразах рядок використовується без цього маркера, наприклад</w:t>
+        <w:t xml:space="preserve">перший безпосередній рядковий аргумент потребує маркера цитування:</w:t>
+      </w:r>
+      <w:r>
+        <w:t xml:space="preserve"> </w:t>
+      </w:r>
+      <w:r>
+        <w:rPr>
+          <w:rStyle w:val="VerbatimChar"/>
+        </w:rPr>
+        <w:t xml:space="preserve"/>
+      </w:r>
+      <w:r>
+        <w:t xml:space="preserve">У наступних аргументах маркер необов’язковий. В інших виразах рядок використовується без цього маркера, наприклад</w:t>
       </w:r>
       <w:r>
         <w:t xml:space="preserve"> </w:t>
@@ -2127,34 +2127,34 @@
         <w:t xml:space="preserve"> </w:t>
       </w:r>
       <w:r>
-        <w:t xml:space="preserve">приймає один або більше аргументів, розділених комами. Аргументом може бути вираз або цитований текст. Перед кожним безпосереднім рядковим аргументом</w:t>
-      </w:r>
-      <w:r>
-        <w:t xml:space="preserve"> </w:t>
-      </w:r>
-      <w:r>
-        <w:rPr>
-          <w:rStyle w:val="VerbatimChar"/>
-        </w:rPr>
-        <w:t xml:space="preserve">Scribe</w:t>
-      </w:r>
-      <w:r>
-        <w:t xml:space="preserve"> </w:t>
-      </w:r>
-      <w:r>
-        <w:t xml:space="preserve">ставиться</w:t>
-      </w:r>
-      <w:r>
-        <w:t xml:space="preserve"> </w:t>
-      </w:r>
-      <w:r>
-        <w:rPr>
-          <w:rStyle w:val="VerbatimChar"/>
-        </w:rPr>
-        <w:t xml:space="preserve">-</w:t>
-      </w:r>
-      <w:r>
-        <w:t xml:space="preserve">.</w:t>
+        <w:t xml:space="preserve">приймає один або більше аргументів, розділених комами. Аргументом може бути вираз або текст. Якщо перший аргумент є безпосереднім рядковим літералом, перед ним обов’язковий дефіс; у наступних аргументах дефіс необов’язковий.</w:t>
+      </w:r>
+      <w:r>
+        <w:t xml:space="preserve"/>
+      </w:r>
+      <w:r>
+        <w:rPr>
+          <w:rStyle w:val="VerbatimChar"/>
+        </w:rPr>
+        <w:t xml:space="preserve"/>
+      </w:r>
+      <w:r>
+        <w:t xml:space="preserve"/>
+      </w:r>
+      <w:r>
+        <w:t xml:space="preserve"/>
+      </w:r>
+      <w:r>
+        <w:t xml:space="preserve"/>
+      </w:r>
+      <w:r>
+        <w:rPr>
+          <w:rStyle w:val="VerbatimChar"/>
+        </w:rPr>
+        <w:t xml:space="preserve"/>
+      </w:r>
+      <w:r>
+        <w:t xml:space="preserve"/>
       </w:r>
     </w:p>
     <w:p>
@@ -2162,64 +2162,64 @@
         <w:pStyle w:val="BodyText"/>
       </w:pPr>
       <w:r>
-        <w:t xml:space="preserve">Дужки не дозволяють обійти маркер цитування:</w:t>
-      </w:r>
-      <w:r>
-        <w:t xml:space="preserve"> </w:t>
-      </w:r>
-      <w:r>
-        <w:rPr>
-          <w:rStyle w:val="VerbatimChar"/>
-        </w:rPr>
-        <w:t xml:space="preserve">Scribe ("text").</w:t>
-      </w:r>
-      <w:r>
-        <w:t xml:space="preserve"> </w:t>
-      </w:r>
-      <w:r>
-        <w:t xml:space="preserve">є помилкою. Проте</w:t>
-      </w:r>
-      <w:r>
-        <w:t xml:space="preserve"> </w:t>
-      </w:r>
-      <w:r>
-        <w:rPr>
-          <w:rStyle w:val="VerbatimChar"/>
-        </w:rPr>
-        <w:t xml:space="preserve">Scribe Legere idem "text".</w:t>
-      </w:r>
-      <w:r>
-        <w:t xml:space="preserve"> </w:t>
-      </w:r>
-      <w:r>
-        <w:t xml:space="preserve">та</w:t>
-      </w:r>
-      <w:r>
-        <w:t xml:space="preserve"> </w:t>
-      </w:r>
-      <w:r>
-        <w:rPr>
-          <w:rStyle w:val="VerbatimChar"/>
-        </w:rPr>
-        <w:t xml:space="preserve">Scribe "text" idem Legere.</w:t>
-      </w:r>
-      <w:r>
-        <w:t xml:space="preserve"> </w:t>
-      </w:r>
-      <w:r>
-        <w:t xml:space="preserve">виводять результат порівняння, а не безпосередній текстовий літерал, тому маркер для них не потрібен. За формою AST кореневий вузол нецитованого аргументу не може бути</w:t>
-      </w:r>
-      <w:r>
-        <w:t xml:space="preserve"> </w:t>
-      </w:r>
-      <w:r>
-        <w:rPr>
-          <w:rStyle w:val="VerbatimChar"/>
-        </w:rPr>
-        <w:t xml:space="preserve">StringLiteralNode</w:t>
-      </w:r>
-      <w:r>
-        <w:t xml:space="preserve">.</w:t>
+        <w:t xml:space="preserve">Дужки не дозволяють обійти маркер для першого рядкового аргументу: Scribe ("text"). є помилкою. Після іншого аргументу рядок можна вивести без маркера. Порівняння з рядком виводить результат порівняння, а не літерал, і маркер не потрібен.</w:t>
+      </w:r>
+      <w:r>
+        <w:t xml:space="preserve"/>
+      </w:r>
+      <w:r>
+        <w:rPr>
+          <w:rStyle w:val="VerbatimChar"/>
+        </w:rPr>
+        <w:t xml:space="preserve"/>
+      </w:r>
+      <w:r>
+        <w:t xml:space="preserve"/>
+      </w:r>
+      <w:r>
+        <w:t xml:space="preserve"/>
+      </w:r>
+      <w:r>
+        <w:t xml:space="preserve"/>
+      </w:r>
+      <w:r>
+        <w:rPr>
+          <w:rStyle w:val="VerbatimChar"/>
+        </w:rPr>
+        <w:t xml:space="preserve"/>
+      </w:r>
+      <w:r>
+        <w:t xml:space="preserve"/>
+      </w:r>
+      <w:r>
+        <w:t xml:space="preserve"/>
+      </w:r>
+      <w:r>
+        <w:t xml:space="preserve"/>
+      </w:r>
+      <w:r>
+        <w:rPr>
+          <w:rStyle w:val="VerbatimChar"/>
+        </w:rPr>
+        <w:t xml:space="preserve"/>
+      </w:r>
+      <w:r>
+        <w:t xml:space="preserve"/>
+      </w:r>
+      <w:r>
+        <w:t xml:space="preserve"/>
+      </w:r>
+      <w:r>
+        <w:t xml:space="preserve"/>
+      </w:r>
+      <w:r>
+        <w:rPr>
+          <w:rStyle w:val="VerbatimChar"/>
+        </w:rPr>
+        <w:t xml:space="preserve"/>
+      </w:r>
+      <w:r>
+        <w:t xml:space="preserve"/>
       </w:r>
     </w:p>
     <w:p>
@@ -2230,7 +2230,9 @@
         <w:rPr>
           <w:rStyle w:val="VerbatimChar"/>
         </w:rPr>
-        <w:t xml:space="preserve">Scribe Count.</w:t>
+        <w:t xml:space="preserve">Scribe Count.
+Scribe Count + 10.
+Scribe - "Valor: ", Count, "/linea".</w:t>
       </w:r>
       <w:r>
         <w:br/>
@@ -2239,7 +2241,7 @@
         <w:rPr>
           <w:rStyle w:val="VerbatimChar"/>
         </w:rPr>
-        <w:t xml:space="preserve">Scribe Count + 10.</w:t>
+        <w:t xml:space="preserve"/>
       </w:r>
       <w:r>
         <w:br/>
@@ -2248,7 +2250,7 @@
         <w:rPr>
           <w:rStyle w:val="VerbatimChar"/>
         </w:rPr>
-        <w:t xml:space="preserve">Scribe - "Valor: ", Count, - "/linea".</w:t>
+        <w:t xml:space="preserve"/>
       </w:r>
     </w:p>
     <w:p>
@@ -3180,7 +3182,7 @@
     </w:p>
     <w:p>
       <w:r>
-        <w:t>Legere читає одне ціле число зі стандартного вводу. Scribe друкує ціле, ludicium як true/false, sententia як текст, безпосередній текстовий літерал з маркером - або об'єкт. Для об'єкта обрано форму Type{field=value, field2=value2} з полями в порядку оголошення; вкладені об'єкти друкуються рекурсивно. Scribe не додає автоматичного переносу рядка; /linea у тексті додає його явно.</w:t>
+        <w:t>Legere читає одне ціле число зі стандартного вводу. Scribe друкує ціле, ludicium як true/false, sententia як текст, безпосередній текстовий літерал (перший аргумент із маркером -) або об'єкт. Для об'єкта обрано форму Type{field=value, field2=value2} з полями в порядку оголошення; вкладені об'єкти друкуються рекурсивно. Scribe не додає автоматичного переносу рядка; /linea у тексті додає його явно.</w:t>
       </w:r>
     </w:p>
     <w:p>

</xml_diff>